<commit_message>
Stabilize smoke sim CI and extend archive theme rollout
</commit_message>
<xml_diff>
--- a/PROJECT_HANDOFF_2026-03-30.docx
+++ b/PROJECT_HANDOFF_2026-03-30.docx
@@ -103,7 +103,7 @@
     </w:p>
     <w:p>
       <w:r>
-        <w:t xml:space="preserve">- Shared controls and navigation chrome now respect the saved accessibility/theme profile.</w:t>
+        <w:t xml:space="preserve">- Shared controls, navigation chrome, and the archive/reference flow now respect the saved accessibility/theme profile.</w:t>
       </w:r>
     </w:p>
     <w:p>
@@ -169,6 +169,11 @@
         <w:t xml:space="preserve">- `npm run smoke:sim`: passed</w:t>
       </w:r>
     </w:p>
+    <w:p>
+      <w:r>
+        <w:t xml:space="preserve">- `npm run smoke:sim` now uses a deterministic seeded path so CI and local reruns exercise the same authored tower instead of rolling live random seeds</w:t>
+      </w:r>
+    </w:p>
     <w:p/>
     <w:p>
       <w:r>
@@ -183,7 +188,7 @@
     </w:p>
     <w:p>
       <w:r>
-        <w:t xml:space="preserve">  - `run-1774909372002-teixdiin`</w:t>
+        <w:t xml:space="preserve">  - `run-1774900000001-84byddd8`</w:t>
       </w:r>
     </w:p>
     <w:p>
@@ -213,7 +218,7 @@
     </w:p>
     <w:p>
       <w:r>
-        <w:t xml:space="preserve">  - `76`</w:t>
+        <w:t xml:space="preserve">  - `75`</w:t>
       </w:r>
     </w:p>
     <w:p>
@@ -243,7 +248,7 @@
     </w:p>
     <w:p>
       <w:r>
-        <w:t xml:space="preserve">  - `16 / 44`</w:t>
+        <w:t xml:space="preserve">  - `1 / 44`</w:t>
       </w:r>
     </w:p>
     <w:p>
@@ -280,7 +285,7 @@
     </w:p>
     <w:p>
       <w:r>
-        <w:t xml:space="preserve">- The durable pass/fail gate is still the acceptance logic inside `scripts/smoke-sim.cjs`, not any one sample reward sequence.</w:t>
+        <w:t xml:space="preserve">- The durable pass/fail gate is still the acceptance logic inside `scripts/smoke-sim.cjs`, but the harness now locks to a deterministic seed so CI does not drift between different tower rolls.</w:t>
       </w:r>
     </w:p>
     <w:p/>
@@ -333,7 +338,7 @@
     </w:p>
     <w:p>
       <w:r>
-        <w:t xml:space="preserve">- Shared controls and chrome already respond to saved accessibility/theme settings, but a full palette migration across every older route is still ongoing.</w:t>
+        <w:t xml:space="preserve">- Shared controls and chrome already respond to saved accessibility/theme settings, and `end-run`, `progression`, and `codex` now follow the same live palette/readability system, but a full palette migration across every older route is still ongoing.</w:t>
       </w:r>
     </w:p>
     <w:p/>

</xml_diff>